<commit_message>
Add guarantor support to document generation: update placeholder replacements, load guarantor relationship in GenerateLoanContractListener, extend tests, and adjust template.
Co-authored-by: Junie <junie@jetbrains.com>
</commit_message>
<xml_diff>
--- a/app/templates/loan_contract.docx
+++ b/app/templates/loan_contract.docx
@@ -164,72 +164,95 @@
     <w:p>
       <w:pPr>
         <w:jc w:val="both"/>
+      </w:pPr>
+      <w:r>
         <w:rPr>
           <w:rFonts w:ascii="Times New Roman" w:hAnsi="Times New Roman" w:cs="Times New Roman"/>
           <w:b/>
           <w:bCs/>
           <w:color w:val="000000" w:themeColor="text1"/>
-          <w:lang w:val="fr-FR"/>
-        </w:rPr>
-      </w:pPr>
+          <w:u w:val="single"/>
+          <w:lang w:val="fr-FR"/>
+        </w:rPr>
+        <w:t>Objet :</w:t>
+      </w:r>
       <w:r>
         <w:rPr>
           <w:rFonts w:ascii="Times New Roman" w:hAnsi="Times New Roman" w:cs="Times New Roman"/>
           <w:b/>
           <w:bCs/>
           <w:color w:val="000000" w:themeColor="text1"/>
-          <w:u w:val="single"/>
-          <w:lang w:val="fr-FR"/>
-        </w:rPr>
-        <w:t>Objet :</w:t>
-      </w:r>
-      <w:r>
-        <w:rPr>
-          <w:rFonts w:ascii="Times New Roman" w:hAnsi="Times New Roman" w:cs="Times New Roman"/>
+          <w:lang w:val="fr-FR"/>
+        </w:rPr>
+        <w:t xml:space="preserve"> </w:t>
+      </w:r>
+      <w:r>
+        <w:t xml:space="preserve">Accord de prêt de </w:t>
+      </w:r>
+      <w:r>
+        <w:fldChar w:fldCharType="begin"/>
+      </w:r>
+      <w:r>
+        <w:instrText xml:space="preserve"> MERGEFIELD </w:instrText>
+      </w:r>
+      <w:r>
+        <w:instrText>=</w:instrText>
+      </w:r>
+      <w:r>
+        <w:instrText xml:space="preserve">loan_amount \* MERGEFORMAT </w:instrText>
+      </w:r>
+      <w:r>
+        <w:fldChar w:fldCharType="separate"/>
+      </w:r>
+      <w:r>
+        <w:rPr>
+          <w:noProof/>
+        </w:rPr>
+        <w:t>«loan_amount»</w:t>
+      </w:r>
+      <w:r>
+        <w:fldChar w:fldCharType="end"/>
+      </w:r>
+    </w:p>
+    <w:p>
+      <w:pPr>
+        <w:jc w:val="both"/>
+      </w:pPr>
+    </w:p>
+    <w:p>
+      <w:pPr>
+        <w:jc w:val="both"/>
+      </w:pPr>
+      <w:r>
+        <w:fldChar w:fldCharType="begin"/>
+      </w:r>
+      <w:r>
+        <w:instrText xml:space="preserve"> MERGEFIELD  =</w:instrText>
+      </w:r>
+      <w:r>
+        <w:instrText>guarantor</w:instrText>
+      </w:r>
+      <w:r>
+        <w:instrText>_name</w:instrText>
+      </w:r>
+      <w:r>
+        <w:instrText xml:space="preserve">  \* MERGEFORMAT </w:instrText>
+      </w:r>
+      <w:r>
+        <w:fldChar w:fldCharType="separate"/>
+      </w:r>
+      <w:r>
+        <w:rPr>
           <w:b/>
           <w:bCs/>
-          <w:color w:val="000000" w:themeColor="text1"/>
-          <w:lang w:val="fr-FR"/>
-        </w:rPr>
-        <w:t xml:space="preserve"> </w:t>
-      </w:r>
-      <w:r>
-        <w:t xml:space="preserve">Accord de prêt de </w:t>
-      </w:r>
-      <w:r>
-        <w:fldChar w:fldCharType="begin"/>
-      </w:r>
-      <w:r>
-        <w:instrText xml:space="preserve"> MERGEFIELD </w:instrText>
-      </w:r>
-      <w:r>
-        <w:instrText>=</w:instrText>
-      </w:r>
-      <w:r>
-        <w:instrText xml:space="preserve">loan_amount \* MERGEFORMAT </w:instrText>
-      </w:r>
-      <w:r>
-        <w:fldChar w:fldCharType="separate"/>
-      </w:r>
-      <w:r>
-        <w:rPr>
           <w:noProof/>
-        </w:rPr>
-        <w:t>«loan_amount»</w:t>
+          <w:lang w:val="fr-FR"/>
+        </w:rPr>
+        <w:t>Erreur ! Aucun nom n'a été donné au signet.</w:t>
       </w:r>
       <w:r>
         <w:fldChar w:fldCharType="end"/>
       </w:r>
-    </w:p>
-    <w:p>
-      <w:pPr>
-        <w:jc w:val="both"/>
-        <w:rPr>
-          <w:rFonts w:ascii="Times New Roman" w:hAnsi="Times New Roman" w:cs="Times New Roman"/>
-          <w:color w:val="000000" w:themeColor="text1"/>
-          <w:lang w:val="fr-FR"/>
-        </w:rPr>
-      </w:pPr>
     </w:p>
     <w:p>
       <w:pPr>
@@ -931,7 +954,7 @@
 <w:hdr xmlns:wpc="http://schemas.microsoft.com/office/word/2010/wordprocessingCanvas" xmlns:cx="http://schemas.microsoft.com/office/drawing/2014/chartex" xmlns:cx1="http://schemas.microsoft.com/office/drawing/2015/9/8/chartex" xmlns:cx2="http://schemas.microsoft.com/office/drawing/2015/10/21/chartex" xmlns:cx3="http://schemas.microsoft.com/office/drawing/2016/5/9/chartex" xmlns:cx4="http://schemas.microsoft.com/office/drawing/2016/5/10/chartex" xmlns:cx5="http://schemas.microsoft.com/office/drawing/2016/5/11/chartex" xmlns:cx6="http://schemas.microsoft.com/office/drawing/2016/5/12/chartex" xmlns:cx7="http://schemas.microsoft.com/office/drawing/2016/5/13/chartex" xmlns:cx8="http://schemas.microsoft.com/office/drawing/2016/5/14/chartex" xmlns:mc="http://schemas.openxmlformats.org/markup-compatibility/2006" xmlns:aink="http://schemas.microsoft.com/office/drawing/2016/ink" xmlns:am3d="http://schemas.microsoft.com/office/drawing/2017/model3d" xmlns:o="urn:schemas-microsoft-com:office:office" xmlns:oel="http://schemas.microsoft.com/office/2019/extlst" xmlns:r="http://schemas.openxmlformats.org/officeDocument/2006/relationships" xmlns:m="http://schemas.openxmlformats.org/officeDocument/2006/math" xmlns:v="urn:schemas-microsoft-com:vml" xmlns:wp14="http://schemas.microsoft.com/office/word/2010/wordprocessingDrawing" xmlns:wp="http://schemas.openxmlformats.org/drawingml/2006/wordprocessingDrawing" xmlns:w10="urn:schemas-microsoft-com:office:word" xmlns:w="http://schemas.openxmlformats.org/wordprocessingml/2006/main" xmlns:w14="http://schemas.microsoft.com/office/word/2010/wordml" xmlns:w15="http://schemas.microsoft.com/office/word/2012/wordml" xmlns:w16cex="http://schemas.microsoft.com/office/word/2018/wordml/cex" xmlns:w16cid="http://schemas.microsoft.com/office/word/2016/wordml/cid" xmlns:w16="http://schemas.microsoft.com/office/word/2018/wordml" xmlns:w16du="http://schemas.microsoft.com/office/word/2023/wordml/word16du" xmlns:w16sdtdh="http://schemas.microsoft.com/office/word/2020/wordml/sdtdatahash" xmlns:w16sdtfl="http://schemas.microsoft.com/office/word/2024/wordml/sdtformatlock" xmlns:w16se="http://schemas.microsoft.com/office/word/2015/wordml/symex" xmlns:wpg="http://schemas.microsoft.com/office/word/2010/wordprocessingGroup" xmlns:wpi="http://schemas.microsoft.com/office/word/2010/wordprocessingInk" xmlns:wne="http://schemas.microsoft.com/office/word/2006/wordml" xmlns:wps="http://schemas.microsoft.com/office/word/2010/wordprocessingShape" mc:Ignorable="w14 w15 w16se w16cid w16 w16cex w16sdtdh w16sdtfl w16du wp14">
   <w:p>
     <w:r>
-      <w:pict w14:anchorId="7E638EE2">
+      <w:pict w14:anchorId="59568739">
         <v:shapetype id="_x0000_t75" coordsize="21600,21600" o:spt="75" o:preferrelative="t" path="m@4@5l@4@11@9@11@9@5xe" filled="f" stroked="f">
           <v:stroke joinstyle="miter"/>
           <v:formulas>

</xml_diff>

<commit_message>
Improve merge field processing in `DocumentGeneratorService`: handle fragmentation, enhance placeholder replacement logic, add guarantor data support, update tests, and adjust template.
</commit_message>
<xml_diff>
--- a/app/templates/loan_contract.docx
+++ b/app/templates/loan_contract.docx
@@ -227,16 +227,13 @@
         <w:fldChar w:fldCharType="begin"/>
       </w:r>
       <w:r>
-        <w:instrText xml:space="preserve"> MERGEFIELD  =</w:instrText>
+        <w:instrText xml:space="preserve"> MERGEFIELD  </w:instrText>
       </w:r>
       <w:r>
         <w:instrText>guarantor</w:instrText>
       </w:r>
       <w:r>
-        <w:instrText>_name</w:instrText>
-      </w:r>
-      <w:r>
-        <w:instrText xml:space="preserve">  \* MERGEFORMAT </w:instrText>
+        <w:instrText xml:space="preserve">_name  \* MERGEFORMAT </w:instrText>
       </w:r>
       <w:r>
         <w:fldChar w:fldCharType="separate"/>
@@ -253,6 +250,11 @@
       <w:r>
         <w:fldChar w:fldCharType="end"/>
       </w:r>
+    </w:p>
+    <w:p>
+      <w:pPr>
+        <w:jc w:val="both"/>
+      </w:pPr>
     </w:p>
     <w:p>
       <w:pPr>
@@ -954,7 +956,7 @@
 <w:hdr xmlns:wpc="http://schemas.microsoft.com/office/word/2010/wordprocessingCanvas" xmlns:cx="http://schemas.microsoft.com/office/drawing/2014/chartex" xmlns:cx1="http://schemas.microsoft.com/office/drawing/2015/9/8/chartex" xmlns:cx2="http://schemas.microsoft.com/office/drawing/2015/10/21/chartex" xmlns:cx3="http://schemas.microsoft.com/office/drawing/2016/5/9/chartex" xmlns:cx4="http://schemas.microsoft.com/office/drawing/2016/5/10/chartex" xmlns:cx5="http://schemas.microsoft.com/office/drawing/2016/5/11/chartex" xmlns:cx6="http://schemas.microsoft.com/office/drawing/2016/5/12/chartex" xmlns:cx7="http://schemas.microsoft.com/office/drawing/2016/5/13/chartex" xmlns:cx8="http://schemas.microsoft.com/office/drawing/2016/5/14/chartex" xmlns:mc="http://schemas.openxmlformats.org/markup-compatibility/2006" xmlns:aink="http://schemas.microsoft.com/office/drawing/2016/ink" xmlns:am3d="http://schemas.microsoft.com/office/drawing/2017/model3d" xmlns:o="urn:schemas-microsoft-com:office:office" xmlns:oel="http://schemas.microsoft.com/office/2019/extlst" xmlns:r="http://schemas.openxmlformats.org/officeDocument/2006/relationships" xmlns:m="http://schemas.openxmlformats.org/officeDocument/2006/math" xmlns:v="urn:schemas-microsoft-com:vml" xmlns:wp14="http://schemas.microsoft.com/office/word/2010/wordprocessingDrawing" xmlns:wp="http://schemas.openxmlformats.org/drawingml/2006/wordprocessingDrawing" xmlns:w10="urn:schemas-microsoft-com:office:word" xmlns:w="http://schemas.openxmlformats.org/wordprocessingml/2006/main" xmlns:w14="http://schemas.microsoft.com/office/word/2010/wordml" xmlns:w15="http://schemas.microsoft.com/office/word/2012/wordml" xmlns:w16cex="http://schemas.microsoft.com/office/word/2018/wordml/cex" xmlns:w16cid="http://schemas.microsoft.com/office/word/2016/wordml/cid" xmlns:w16="http://schemas.microsoft.com/office/word/2018/wordml" xmlns:w16du="http://schemas.microsoft.com/office/word/2023/wordml/word16du" xmlns:w16sdtdh="http://schemas.microsoft.com/office/word/2020/wordml/sdtdatahash" xmlns:w16sdtfl="http://schemas.microsoft.com/office/word/2024/wordml/sdtformatlock" xmlns:w16se="http://schemas.microsoft.com/office/word/2015/wordml/symex" xmlns:wpg="http://schemas.microsoft.com/office/word/2010/wordprocessingGroup" xmlns:wpi="http://schemas.microsoft.com/office/word/2010/wordprocessingInk" xmlns:wne="http://schemas.microsoft.com/office/word/2006/wordml" xmlns:wps="http://schemas.microsoft.com/office/word/2010/wordprocessingShape" mc:Ignorable="w14 w15 w16se w16cid w16 w16cex w16sdtdh w16sdtfl w16du wp14">
   <w:p>
     <w:r>
-      <w:pict w14:anchorId="59568739">
+      <w:pict w14:anchorId="5C59C59E">
         <v:shapetype id="_x0000_t75" coordsize="21600,21600" o:spt="75" o:preferrelative="t" path="m@4@5l@4@11@9@11@9@5xe" filled="f" stroked="f">
           <v:stroke joinstyle="miter"/>
           <v:formulas>

</xml_diff>